<commit_message>
Adiciona Secao 3.6 (sensibilidade do protocolo) ao manuscrito e pacote de submissao
- outputs/manuscript/: manuscrito atualizado com nova Secao 3.6 formal
  ('Sensitivity of Headline Utility Metrics to Evaluation-Protocol Choices at
  n~20'), com tabela das 7 reprocessagens (original, quebrado, 3 testes de
  isolamento, PEERFIX1 baseline e sensitivity) -- torna a instabilidade
  metodologica um achado explicito do artigo, nao uma nota lateral.
- outputs/submission_package/: carta de apresentacao, highlights (Elsevier,
  <=85 caracteres/item) e declaracoes de autoria (CRediT, conflito de
  interesse, declaracao de uso de IA generativa -- incluindo uso em
  metodologia/analise, nao so redacao -- e disponibilidade de dados),
  como ponto de partida para a submissao. Marcados com notas onde exigem
  confirmacao/ajuste dos autores antes de enviar.
</commit_message>
<xml_diff>
--- a/outputs/manuscript/manuscrito_revisado_ICD_v3_PEERFIX1.docx
+++ b/outputs/manuscript/manuscrito_revisado_ICD_v3_PEERFIX1.docx
@@ -2838,7 +2838,1053 @@
           <w:b/>
           <w:bCs/>
         </w:rPr>
-        <w:t xml:space="preserve">3.5 Practical Implications: Augmenting — Not Replacing — Designed Experiments</w:t>
+        <w:t xml:space="preserve">3.6 Sensitivity of Headline Utility Metrics to Evaluation-Protocol Choices at n≈20</w:t>
+      </w:r>
+    </w:p>
+    <w:p>
+      <w:pPr>
+        <w:spacing w:after="200" w:before="0"/>
+      </w:pPr>
+      <w:r>
+        <w:rPr>
+          <w:rFonts w:ascii="Calibri" w:cs="Calibri" w:eastAsia="Calibri" w:hAnsi="Calibri"/>
+          <w:b w:val="false"/>
+          <w:bCs w:val="false"/>
+          <w:i w:val="false"/>
+          <w:iCs w:val="false"/>
+          <w:sz w:val="22"/>
+          <w:szCs w:val="22"/>
+        </w:rPr>
+        <w:t xml:space="preserve">During manuscript revision, an independent reprocessing of the generation-and-evaluation pipeline produced TSTR_best values that were negative for all four generators, apparently contradicting the results in Sections 3.2–3.3. A variable-isolation analysis traced this to two silent methodological differences relative to the protocol described in Section 2.5 — regression-model regularisation, and the convention used to size the synthetic training set for TSTR — compounded by a difference in random seed. Table 3 reports TVAE's TSTR_best under each combination, holding the real dataset, target variable, and generator fixed.</w:t>
+      </w:r>
+    </w:p>
+    <w:tbl>
+      <w:tblPr>
+        <w:tblW w:type="dxa" w:w="10000"/>
+        <w:tblBorders>
+          <w:top w:val="single" w:color="auto" w:sz="4"/>
+          <w:left w:val="single" w:color="auto" w:sz="4"/>
+          <w:bottom w:val="single" w:color="auto" w:sz="4"/>
+          <w:right w:val="single" w:color="auto" w:sz="4"/>
+          <w:insideH w:val="single" w:color="auto" w:sz="4"/>
+          <w:insideV w:val="single" w:color="auto" w:sz="4"/>
+        </w:tblBorders>
+      </w:tblPr>
+      <w:tblGrid>
+        <w:gridCol w:w="3200"/>
+        <w:gridCol w:w="1900"/>
+        <w:gridCol w:w="2200"/>
+        <w:gridCol w:w="900"/>
+        <w:gridCol w:w="1800"/>
+      </w:tblGrid>
+      <w:tr>
+        <w:trPr>
+          <w:tblHeader/>
+        </w:trPr>
+        <w:tc>
+          <w:tcPr>
+            <w:tcW w:type="dxa" w:w="3200"/>
+            <w:shd w:fill="D9E2F3" w:val="clear"/>
+            <w:tcMar>
+              <w:top w:type="dxa" w:w="80"/>
+              <w:left w:type="dxa" w:w="100"/>
+              <w:bottom w:type="dxa" w:w="80"/>
+              <w:right w:type="dxa" w:w="100"/>
+            </w:tcMar>
+          </w:tcPr>
+          <w:p>
+            <w:r>
+              <w:rPr>
+                <w:rFonts w:ascii="Calibri" w:cs="Calibri" w:eastAsia="Calibri" w:hAnsi="Calibri"/>
+                <w:b/>
+                <w:bCs/>
+                <w:sz w:val="20"/>
+                <w:szCs w:val="20"/>
+              </w:rPr>
+              <w:t xml:space="preserve">Configuration</w:t>
+            </w:r>
+          </w:p>
+        </w:tc>
+        <w:tc>
+          <w:tcPr>
+            <w:tcW w:type="dxa" w:w="1900"/>
+            <w:shd w:fill="D9E2F3" w:val="clear"/>
+            <w:tcMar>
+              <w:top w:type="dxa" w:w="80"/>
+              <w:left w:type="dxa" w:w="100"/>
+              <w:bottom w:type="dxa" w:w="80"/>
+              <w:right w:type="dxa" w:w="100"/>
+            </w:tcMar>
+          </w:tcPr>
+          <w:p>
+            <w:r>
+              <w:rPr>
+                <w:rFonts w:ascii="Calibri" w:cs="Calibri" w:eastAsia="Calibri" w:hAnsi="Calibri"/>
+                <w:b/>
+                <w:bCs/>
+                <w:sz w:val="20"/>
+                <w:szCs w:val="20"/>
+              </w:rPr>
+              <w:t xml:space="preserve">RF regularised (max_depth=15)</w:t>
+            </w:r>
+          </w:p>
+        </w:tc>
+        <w:tc>
+          <w:tcPr>
+            <w:tcW w:type="dxa" w:w="2200"/>
+            <w:shd w:fill="D9E2F3" w:val="clear"/>
+            <w:tcMar>
+              <w:top w:type="dxa" w:w="80"/>
+              <w:left w:type="dxa" w:w="100"/>
+              <w:bottom w:type="dxa" w:w="80"/>
+              <w:right w:type="dxa" w:w="100"/>
+            </w:tcMar>
+          </w:tcPr>
+          <w:p>
+            <w:r>
+              <w:rPr>
+                <w:rFonts w:ascii="Calibri" w:cs="Calibri" w:eastAsia="Calibri" w:hAnsi="Calibri"/>
+                <w:b/>
+                <w:bCs/>
+                <w:sz w:val="20"/>
+                <w:szCs w:val="20"/>
+              </w:rPr>
+              <w:t xml:space="preserve">TSTR trained on full n_synthetic=140</w:t>
+            </w:r>
+          </w:p>
+        </w:tc>
+        <w:tc>
+          <w:tcPr>
+            <w:tcW w:type="dxa" w:w="900"/>
+            <w:shd w:fill="D9E2F3" w:val="clear"/>
+            <w:tcMar>
+              <w:top w:type="dxa" w:w="80"/>
+              <w:left w:type="dxa" w:w="100"/>
+              <w:bottom w:type="dxa" w:w="80"/>
+              <w:right w:type="dxa" w:w="100"/>
+            </w:tcMar>
+          </w:tcPr>
+          <w:p>
+            <w:r>
+              <w:rPr>
+                <w:rFonts w:ascii="Calibri" w:cs="Calibri" w:eastAsia="Calibri" w:hAnsi="Calibri"/>
+                <w:b/>
+                <w:bCs/>
+                <w:sz w:val="20"/>
+                <w:szCs w:val="20"/>
+              </w:rPr>
+              <w:t xml:space="preserve">Seed</w:t>
+            </w:r>
+          </w:p>
+        </w:tc>
+        <w:tc>
+          <w:tcPr>
+            <w:tcW w:type="dxa" w:w="1800"/>
+            <w:shd w:fill="D9E2F3" w:val="clear"/>
+            <w:tcMar>
+              <w:top w:type="dxa" w:w="80"/>
+              <w:left w:type="dxa" w:w="100"/>
+              <w:bottom w:type="dxa" w:w="80"/>
+              <w:right w:type="dxa" w:w="100"/>
+            </w:tcMar>
+          </w:tcPr>
+          <w:p>
+            <w:r>
+              <w:rPr>
+                <w:rFonts w:ascii="Calibri" w:cs="Calibri" w:eastAsia="Calibri" w:hAnsi="Calibri"/>
+                <w:b/>
+                <w:bCs/>
+                <w:sz w:val="20"/>
+                <w:szCs w:val="20"/>
+              </w:rPr>
+              <w:t xml:space="preserve">TVAE TSTR_best</w:t>
+            </w:r>
+          </w:p>
+        </w:tc>
+      </w:tr>
+      <w:tr>
+        <w:tc>
+          <w:tcPr>
+            <w:tcW w:type="dxa" w:w="3200"/>
+            <w:tcMar>
+              <w:top w:type="dxa" w:w="80"/>
+              <w:left w:type="dxa" w:w="100"/>
+              <w:bottom w:type="dxa" w:w="80"/>
+              <w:right w:type="dxa" w:w="100"/>
+            </w:tcMar>
+          </w:tcPr>
+          <w:p>
+            <w:r>
+              <w:rPr>
+                <w:rFonts w:ascii="Calibri" w:cs="Calibri" w:eastAsia="Calibri" w:hAnsi="Calibri"/>
+                <w:b w:val="false"/>
+                <w:bCs w:val="false"/>
+                <w:sz w:val="20"/>
+                <w:szCs w:val="20"/>
+              </w:rPr>
+              <w:t xml:space="preserve">Original verified run (manuscript basis)</w:t>
+            </w:r>
+          </w:p>
+        </w:tc>
+        <w:tc>
+          <w:tcPr>
+            <w:tcW w:type="dxa" w:w="1900"/>
+            <w:tcMar>
+              <w:top w:type="dxa" w:w="80"/>
+              <w:left w:type="dxa" w:w="100"/>
+              <w:bottom w:type="dxa" w:w="80"/>
+              <w:right w:type="dxa" w:w="100"/>
+            </w:tcMar>
+          </w:tcPr>
+          <w:p>
+            <w:r>
+              <w:rPr>
+                <w:rFonts w:ascii="Calibri" w:cs="Calibri" w:eastAsia="Calibri" w:hAnsi="Calibri"/>
+                <w:b w:val="false"/>
+                <w:bCs w:val="false"/>
+                <w:sz w:val="20"/>
+                <w:szCs w:val="20"/>
+              </w:rPr>
+              <w:t xml:space="preserve">Yes</w:t>
+            </w:r>
+          </w:p>
+        </w:tc>
+        <w:tc>
+          <w:tcPr>
+            <w:tcW w:type="dxa" w:w="2200"/>
+            <w:tcMar>
+              <w:top w:type="dxa" w:w="80"/>
+              <w:left w:type="dxa" w:w="100"/>
+              <w:bottom w:type="dxa" w:w="80"/>
+              <w:right w:type="dxa" w:w="100"/>
+            </w:tcMar>
+          </w:tcPr>
+          <w:p>
+            <w:r>
+              <w:rPr>
+                <w:rFonts w:ascii="Calibri" w:cs="Calibri" w:eastAsia="Calibri" w:hAnsi="Calibri"/>
+                <w:b w:val="false"/>
+                <w:bCs w:val="false"/>
+                <w:sz w:val="20"/>
+                <w:szCs w:val="20"/>
+              </w:rPr>
+              <w:t xml:space="preserve">Yes</w:t>
+            </w:r>
+          </w:p>
+        </w:tc>
+        <w:tc>
+          <w:tcPr>
+            <w:tcW w:type="dxa" w:w="900"/>
+            <w:tcMar>
+              <w:top w:type="dxa" w:w="80"/>
+              <w:left w:type="dxa" w:w="100"/>
+              <w:bottom w:type="dxa" w:w="80"/>
+              <w:right w:type="dxa" w:w="100"/>
+            </w:tcMar>
+          </w:tcPr>
+          <w:p>
+            <w:r>
+              <w:rPr>
+                <w:rFonts w:ascii="Calibri" w:cs="Calibri" w:eastAsia="Calibri" w:hAnsi="Calibri"/>
+                <w:b w:val="false"/>
+                <w:bCs w:val="false"/>
+                <w:sz w:val="20"/>
+                <w:szCs w:val="20"/>
+              </w:rPr>
+              <w:t xml:space="preserve">123</w:t>
+            </w:r>
+          </w:p>
+        </w:tc>
+        <w:tc>
+          <w:tcPr>
+            <w:tcW w:type="dxa" w:w="1800"/>
+            <w:tcMar>
+              <w:top w:type="dxa" w:w="80"/>
+              <w:left w:type="dxa" w:w="100"/>
+              <w:bottom w:type="dxa" w:w="80"/>
+              <w:right w:type="dxa" w:w="100"/>
+            </w:tcMar>
+          </w:tcPr>
+          <w:p>
+            <w:r>
+              <w:rPr>
+                <w:rFonts w:ascii="Calibri" w:cs="Calibri" w:eastAsia="Calibri" w:hAnsi="Calibri"/>
+                <w:b w:val="false"/>
+                <w:bCs w:val="false"/>
+                <w:sz w:val="20"/>
+                <w:szCs w:val="20"/>
+              </w:rPr>
+              <w:t xml:space="preserve">0.668</w:t>
+            </w:r>
+          </w:p>
+        </w:tc>
+      </w:tr>
+      <w:tr>
+        <w:tc>
+          <w:tcPr>
+            <w:tcW w:type="dxa" w:w="3200"/>
+            <w:tcMar>
+              <w:top w:type="dxa" w:w="80"/>
+              <w:left w:type="dxa" w:w="100"/>
+              <w:bottom w:type="dxa" w:w="80"/>
+              <w:right w:type="dxa" w:w="100"/>
+            </w:tcMar>
+          </w:tcPr>
+          <w:p>
+            <w:r>
+              <w:rPr>
+                <w:rFonts w:ascii="Calibri" w:cs="Calibri" w:eastAsia="Calibri" w:hAnsi="Calibri"/>
+                <w:b w:val="false"/>
+                <w:bCs w:val="false"/>
+                <w:sz w:val="20"/>
+                <w:szCs w:val="20"/>
+              </w:rPr>
+              <w:t xml:space="preserve">Independent rerun (unmodified)</w:t>
+            </w:r>
+          </w:p>
+        </w:tc>
+        <w:tc>
+          <w:tcPr>
+            <w:tcW w:type="dxa" w:w="1900"/>
+            <w:tcMar>
+              <w:top w:type="dxa" w:w="80"/>
+              <w:left w:type="dxa" w:w="100"/>
+              <w:bottom w:type="dxa" w:w="80"/>
+              <w:right w:type="dxa" w:w="100"/>
+            </w:tcMar>
+          </w:tcPr>
+          <w:p>
+            <w:r>
+              <w:rPr>
+                <w:rFonts w:ascii="Calibri" w:cs="Calibri" w:eastAsia="Calibri" w:hAnsi="Calibri"/>
+                <w:b w:val="false"/>
+                <w:bCs w:val="false"/>
+                <w:sz w:val="20"/>
+                <w:szCs w:val="20"/>
+              </w:rPr>
+              <w:t xml:space="preserve">No</w:t>
+            </w:r>
+          </w:p>
+        </w:tc>
+        <w:tc>
+          <w:tcPr>
+            <w:tcW w:type="dxa" w:w="2200"/>
+            <w:tcMar>
+              <w:top w:type="dxa" w:w="80"/>
+              <w:left w:type="dxa" w:w="100"/>
+              <w:bottom w:type="dxa" w:w="80"/>
+              <w:right w:type="dxa" w:w="100"/>
+            </w:tcMar>
+          </w:tcPr>
+          <w:p>
+            <w:r>
+              <w:rPr>
+                <w:rFonts w:ascii="Calibri" w:cs="Calibri" w:eastAsia="Calibri" w:hAnsi="Calibri"/>
+                <w:b w:val="false"/>
+                <w:bCs w:val="false"/>
+                <w:sz w:val="20"/>
+                <w:szCs w:val="20"/>
+              </w:rPr>
+              <w:t xml:space="preserve">No (subsampled to ≈15)</w:t>
+            </w:r>
+          </w:p>
+        </w:tc>
+        <w:tc>
+          <w:tcPr>
+            <w:tcW w:type="dxa" w:w="900"/>
+            <w:tcMar>
+              <w:top w:type="dxa" w:w="80"/>
+              <w:left w:type="dxa" w:w="100"/>
+              <w:bottom w:type="dxa" w:w="80"/>
+              <w:right w:type="dxa" w:w="100"/>
+            </w:tcMar>
+          </w:tcPr>
+          <w:p>
+            <w:r>
+              <w:rPr>
+                <w:rFonts w:ascii="Calibri" w:cs="Calibri" w:eastAsia="Calibri" w:hAnsi="Calibri"/>
+                <w:b w:val="false"/>
+                <w:bCs w:val="false"/>
+                <w:sz w:val="20"/>
+                <w:szCs w:val="20"/>
+              </w:rPr>
+              <w:t xml:space="preserve">42</w:t>
+            </w:r>
+          </w:p>
+        </w:tc>
+        <w:tc>
+          <w:tcPr>
+            <w:tcW w:type="dxa" w:w="1800"/>
+            <w:tcMar>
+              <w:top w:type="dxa" w:w="80"/>
+              <w:left w:type="dxa" w:w="100"/>
+              <w:bottom w:type="dxa" w:w="80"/>
+              <w:right w:type="dxa" w:w="100"/>
+            </w:tcMar>
+          </w:tcPr>
+          <w:p>
+            <w:r>
+              <w:rPr>
+                <w:rFonts w:ascii="Calibri" w:cs="Calibri" w:eastAsia="Calibri" w:hAnsi="Calibri"/>
+                <w:b w:val="false"/>
+                <w:bCs w:val="false"/>
+                <w:sz w:val="20"/>
+                <w:szCs w:val="20"/>
+              </w:rPr>
+              <w:t xml:space="preserve">−0.254</w:t>
+            </w:r>
+          </w:p>
+        </w:tc>
+      </w:tr>
+      <w:tr>
+        <w:tc>
+          <w:tcPr>
+            <w:tcW w:type="dxa" w:w="3200"/>
+            <w:tcMar>
+              <w:top w:type="dxa" w:w="80"/>
+              <w:left w:type="dxa" w:w="100"/>
+              <w:bottom w:type="dxa" w:w="80"/>
+              <w:right w:type="dxa" w:w="100"/>
+            </w:tcMar>
+          </w:tcPr>
+          <w:p>
+            <w:r>
+              <w:rPr>
+                <w:rFonts w:ascii="Calibri" w:cs="Calibri" w:eastAsia="Calibri" w:hAnsi="Calibri"/>
+                <w:b w:val="false"/>
+                <w:bCs w:val="false"/>
+                <w:sz w:val="20"/>
+                <w:szCs w:val="20"/>
+              </w:rPr>
+              <w:t xml:space="preserve">Isolation test 1</w:t>
+            </w:r>
+          </w:p>
+        </w:tc>
+        <w:tc>
+          <w:tcPr>
+            <w:tcW w:type="dxa" w:w="1900"/>
+            <w:tcMar>
+              <w:top w:type="dxa" w:w="80"/>
+              <w:left w:type="dxa" w:w="100"/>
+              <w:bottom w:type="dxa" w:w="80"/>
+              <w:right w:type="dxa" w:w="100"/>
+            </w:tcMar>
+          </w:tcPr>
+          <w:p>
+            <w:r>
+              <w:rPr>
+                <w:rFonts w:ascii="Calibri" w:cs="Calibri" w:eastAsia="Calibri" w:hAnsi="Calibri"/>
+                <w:b w:val="false"/>
+                <w:bCs w:val="false"/>
+                <w:sz w:val="20"/>
+                <w:szCs w:val="20"/>
+              </w:rPr>
+              <w:t xml:space="preserve">Yes</w:t>
+            </w:r>
+          </w:p>
+        </w:tc>
+        <w:tc>
+          <w:tcPr>
+            <w:tcW w:type="dxa" w:w="2200"/>
+            <w:tcMar>
+              <w:top w:type="dxa" w:w="80"/>
+              <w:left w:type="dxa" w:w="100"/>
+              <w:bottom w:type="dxa" w:w="80"/>
+              <w:right w:type="dxa" w:w="100"/>
+            </w:tcMar>
+          </w:tcPr>
+          <w:p>
+            <w:r>
+              <w:rPr>
+                <w:rFonts w:ascii="Calibri" w:cs="Calibri" w:eastAsia="Calibri" w:hAnsi="Calibri"/>
+                <w:b w:val="false"/>
+                <w:bCs w:val="false"/>
+                <w:sz w:val="20"/>
+                <w:szCs w:val="20"/>
+              </w:rPr>
+              <w:t xml:space="preserve">No (subsampled to ≈15)</w:t>
+            </w:r>
+          </w:p>
+        </w:tc>
+        <w:tc>
+          <w:tcPr>
+            <w:tcW w:type="dxa" w:w="900"/>
+            <w:tcMar>
+              <w:top w:type="dxa" w:w="80"/>
+              <w:left w:type="dxa" w:w="100"/>
+              <w:bottom w:type="dxa" w:w="80"/>
+              <w:right w:type="dxa" w:w="100"/>
+            </w:tcMar>
+          </w:tcPr>
+          <w:p>
+            <w:r>
+              <w:rPr>
+                <w:rFonts w:ascii="Calibri" w:cs="Calibri" w:eastAsia="Calibri" w:hAnsi="Calibri"/>
+                <w:b w:val="false"/>
+                <w:bCs w:val="false"/>
+                <w:sz w:val="20"/>
+                <w:szCs w:val="20"/>
+              </w:rPr>
+              <w:t xml:space="preserve">42</w:t>
+            </w:r>
+          </w:p>
+        </w:tc>
+        <w:tc>
+          <w:tcPr>
+            <w:tcW w:type="dxa" w:w="1800"/>
+            <w:tcMar>
+              <w:top w:type="dxa" w:w="80"/>
+              <w:left w:type="dxa" w:w="100"/>
+              <w:bottom w:type="dxa" w:w="80"/>
+              <w:right w:type="dxa" w:w="100"/>
+            </w:tcMar>
+          </w:tcPr>
+          <w:p>
+            <w:r>
+              <w:rPr>
+                <w:rFonts w:ascii="Calibri" w:cs="Calibri" w:eastAsia="Calibri" w:hAnsi="Calibri"/>
+                <w:b w:val="false"/>
+                <w:bCs w:val="false"/>
+                <w:sz w:val="20"/>
+                <w:szCs w:val="20"/>
+              </w:rPr>
+              <w:t xml:space="preserve">0.039</w:t>
+            </w:r>
+          </w:p>
+        </w:tc>
+      </w:tr>
+      <w:tr>
+        <w:tc>
+          <w:tcPr>
+            <w:tcW w:type="dxa" w:w="3200"/>
+            <w:tcMar>
+              <w:top w:type="dxa" w:w="80"/>
+              <w:left w:type="dxa" w:w="100"/>
+              <w:bottom w:type="dxa" w:w="80"/>
+              <w:right w:type="dxa" w:w="100"/>
+            </w:tcMar>
+          </w:tcPr>
+          <w:p>
+            <w:r>
+              <w:rPr>
+                <w:rFonts w:ascii="Calibri" w:cs="Calibri" w:eastAsia="Calibri" w:hAnsi="Calibri"/>
+                <w:b w:val="false"/>
+                <w:bCs w:val="false"/>
+                <w:sz w:val="20"/>
+                <w:szCs w:val="20"/>
+              </w:rPr>
+              <w:t xml:space="preserve">Isolation test 2</w:t>
+            </w:r>
+          </w:p>
+        </w:tc>
+        <w:tc>
+          <w:tcPr>
+            <w:tcW w:type="dxa" w:w="1900"/>
+            <w:tcMar>
+              <w:top w:type="dxa" w:w="80"/>
+              <w:left w:type="dxa" w:w="100"/>
+              <w:bottom w:type="dxa" w:w="80"/>
+              <w:right w:type="dxa" w:w="100"/>
+            </w:tcMar>
+          </w:tcPr>
+          <w:p>
+            <w:r>
+              <w:rPr>
+                <w:rFonts w:ascii="Calibri" w:cs="Calibri" w:eastAsia="Calibri" w:hAnsi="Calibri"/>
+                <w:b w:val="false"/>
+                <w:bCs w:val="false"/>
+                <w:sz w:val="20"/>
+                <w:szCs w:val="20"/>
+              </w:rPr>
+              <w:t xml:space="preserve">Yes</w:t>
+            </w:r>
+          </w:p>
+        </w:tc>
+        <w:tc>
+          <w:tcPr>
+            <w:tcW w:type="dxa" w:w="2200"/>
+            <w:tcMar>
+              <w:top w:type="dxa" w:w="80"/>
+              <w:left w:type="dxa" w:w="100"/>
+              <w:bottom w:type="dxa" w:w="80"/>
+              <w:right w:type="dxa" w:w="100"/>
+            </w:tcMar>
+          </w:tcPr>
+          <w:p>
+            <w:r>
+              <w:rPr>
+                <w:rFonts w:ascii="Calibri" w:cs="Calibri" w:eastAsia="Calibri" w:hAnsi="Calibri"/>
+                <w:b w:val="false"/>
+                <w:bCs w:val="false"/>
+                <w:sz w:val="20"/>
+                <w:szCs w:val="20"/>
+              </w:rPr>
+              <w:t xml:space="preserve">Yes</w:t>
+            </w:r>
+          </w:p>
+        </w:tc>
+        <w:tc>
+          <w:tcPr>
+            <w:tcW w:type="dxa" w:w="900"/>
+            <w:tcMar>
+              <w:top w:type="dxa" w:w="80"/>
+              <w:left w:type="dxa" w:w="100"/>
+              <w:bottom w:type="dxa" w:w="80"/>
+              <w:right w:type="dxa" w:w="100"/>
+            </w:tcMar>
+          </w:tcPr>
+          <w:p>
+            <w:r>
+              <w:rPr>
+                <w:rFonts w:ascii="Calibri" w:cs="Calibri" w:eastAsia="Calibri" w:hAnsi="Calibri"/>
+                <w:b w:val="false"/>
+                <w:bCs w:val="false"/>
+                <w:sz w:val="20"/>
+                <w:szCs w:val="20"/>
+              </w:rPr>
+              <w:t xml:space="preserve">42</w:t>
+            </w:r>
+          </w:p>
+        </w:tc>
+        <w:tc>
+          <w:tcPr>
+            <w:tcW w:type="dxa" w:w="1800"/>
+            <w:tcMar>
+              <w:top w:type="dxa" w:w="80"/>
+              <w:left w:type="dxa" w:w="100"/>
+              <w:bottom w:type="dxa" w:w="80"/>
+              <w:right w:type="dxa" w:w="100"/>
+            </w:tcMar>
+          </w:tcPr>
+          <w:p>
+            <w:r>
+              <w:rPr>
+                <w:rFonts w:ascii="Calibri" w:cs="Calibri" w:eastAsia="Calibri" w:hAnsi="Calibri"/>
+                <w:b w:val="false"/>
+                <w:bCs w:val="false"/>
+                <w:sz w:val="20"/>
+                <w:szCs w:val="20"/>
+              </w:rPr>
+              <w:t xml:space="preserve">0.207</w:t>
+            </w:r>
+          </w:p>
+        </w:tc>
+      </w:tr>
+      <w:tr>
+        <w:tc>
+          <w:tcPr>
+            <w:tcW w:type="dxa" w:w="3200"/>
+            <w:tcMar>
+              <w:top w:type="dxa" w:w="80"/>
+              <w:left w:type="dxa" w:w="100"/>
+              <w:bottom w:type="dxa" w:w="80"/>
+              <w:right w:type="dxa" w:w="100"/>
+            </w:tcMar>
+          </w:tcPr>
+          <w:p>
+            <w:r>
+              <w:rPr>
+                <w:rFonts w:ascii="Calibri" w:cs="Calibri" w:eastAsia="Calibri" w:hAnsi="Calibri"/>
+                <w:b w:val="false"/>
+                <w:bCs w:val="false"/>
+                <w:sz w:val="20"/>
+                <w:szCs w:val="20"/>
+              </w:rPr>
+              <w:t xml:space="preserve">Isolation test 3</w:t>
+            </w:r>
+          </w:p>
+        </w:tc>
+        <w:tc>
+          <w:tcPr>
+            <w:tcW w:type="dxa" w:w="1900"/>
+            <w:tcMar>
+              <w:top w:type="dxa" w:w="80"/>
+              <w:left w:type="dxa" w:w="100"/>
+              <w:bottom w:type="dxa" w:w="80"/>
+              <w:right w:type="dxa" w:w="100"/>
+            </w:tcMar>
+          </w:tcPr>
+          <w:p>
+            <w:r>
+              <w:rPr>
+                <w:rFonts w:ascii="Calibri" w:cs="Calibri" w:eastAsia="Calibri" w:hAnsi="Calibri"/>
+                <w:b w:val="false"/>
+                <w:bCs w:val="false"/>
+                <w:sz w:val="20"/>
+                <w:szCs w:val="20"/>
+              </w:rPr>
+              <w:t xml:space="preserve">Yes</w:t>
+            </w:r>
+          </w:p>
+        </w:tc>
+        <w:tc>
+          <w:tcPr>
+            <w:tcW w:type="dxa" w:w="2200"/>
+            <w:tcMar>
+              <w:top w:type="dxa" w:w="80"/>
+              <w:left w:type="dxa" w:w="100"/>
+              <w:bottom w:type="dxa" w:w="80"/>
+              <w:right w:type="dxa" w:w="100"/>
+            </w:tcMar>
+          </w:tcPr>
+          <w:p>
+            <w:r>
+              <w:rPr>
+                <w:rFonts w:ascii="Calibri" w:cs="Calibri" w:eastAsia="Calibri" w:hAnsi="Calibri"/>
+                <w:b w:val="false"/>
+                <w:bCs w:val="false"/>
+                <w:sz w:val="20"/>
+                <w:szCs w:val="20"/>
+              </w:rPr>
+              <w:t xml:space="preserve">Yes</w:t>
+            </w:r>
+          </w:p>
+        </w:tc>
+        <w:tc>
+          <w:tcPr>
+            <w:tcW w:type="dxa" w:w="900"/>
+            <w:tcMar>
+              <w:top w:type="dxa" w:w="80"/>
+              <w:left w:type="dxa" w:w="100"/>
+              <w:bottom w:type="dxa" w:w="80"/>
+              <w:right w:type="dxa" w:w="100"/>
+            </w:tcMar>
+          </w:tcPr>
+          <w:p>
+            <w:r>
+              <w:rPr>
+                <w:rFonts w:ascii="Calibri" w:cs="Calibri" w:eastAsia="Calibri" w:hAnsi="Calibri"/>
+                <w:b w:val="false"/>
+                <w:bCs w:val="false"/>
+                <w:sz w:val="20"/>
+                <w:szCs w:val="20"/>
+              </w:rPr>
+              <w:t xml:space="preserve">123</w:t>
+            </w:r>
+          </w:p>
+        </w:tc>
+        <w:tc>
+          <w:tcPr>
+            <w:tcW w:type="dxa" w:w="1800"/>
+            <w:tcMar>
+              <w:top w:type="dxa" w:w="80"/>
+              <w:left w:type="dxa" w:w="100"/>
+              <w:bottom w:type="dxa" w:w="80"/>
+              <w:right w:type="dxa" w:w="100"/>
+            </w:tcMar>
+          </w:tcPr>
+          <w:p>
+            <w:r>
+              <w:rPr>
+                <w:rFonts w:ascii="Calibri" w:cs="Calibri" w:eastAsia="Calibri" w:hAnsi="Calibri"/>
+                <w:b w:val="false"/>
+                <w:bCs w:val="false"/>
+                <w:sz w:val="20"/>
+                <w:szCs w:val="20"/>
+              </w:rPr>
+              <w:t xml:space="preserve">0.442</w:t>
+            </w:r>
+          </w:p>
+        </w:tc>
+      </w:tr>
+      <w:tr>
+        <w:tc>
+          <w:tcPr>
+            <w:tcW w:type="dxa" w:w="3200"/>
+            <w:tcMar>
+              <w:top w:type="dxa" w:w="80"/>
+              <w:left w:type="dxa" w:w="100"/>
+              <w:bottom w:type="dxa" w:w="80"/>
+              <w:right w:type="dxa" w:w="100"/>
+            </w:tcMar>
+          </w:tcPr>
+          <w:p>
+            <w:r>
+              <w:rPr>
+                <w:rFonts w:ascii="Calibri" w:cs="Calibri" w:eastAsia="Calibri" w:hAnsi="Calibri"/>
+                <w:b w:val="false"/>
+                <w:bCs w:val="false"/>
+                <w:sz w:val="20"/>
+                <w:szCs w:val="20"/>
+              </w:rPr>
+              <w:t xml:space="preserve">PEERFIX1 baseline (this manuscript, Section 3.2)</w:t>
+            </w:r>
+          </w:p>
+        </w:tc>
+        <w:tc>
+          <w:tcPr>
+            <w:tcW w:type="dxa" w:w="1900"/>
+            <w:tcMar>
+              <w:top w:type="dxa" w:w="80"/>
+              <w:left w:type="dxa" w:w="100"/>
+              <w:bottom w:type="dxa" w:w="80"/>
+              <w:right w:type="dxa" w:w="100"/>
+            </w:tcMar>
+          </w:tcPr>
+          <w:p>
+            <w:r>
+              <w:rPr>
+                <w:rFonts w:ascii="Calibri" w:cs="Calibri" w:eastAsia="Calibri" w:hAnsi="Calibri"/>
+                <w:b w:val="false"/>
+                <w:bCs w:val="false"/>
+                <w:sz w:val="20"/>
+                <w:szCs w:val="20"/>
+              </w:rPr>
+              <w:t xml:space="preserve">Yes</w:t>
+            </w:r>
+          </w:p>
+        </w:tc>
+        <w:tc>
+          <w:tcPr>
+            <w:tcW w:type="dxa" w:w="2200"/>
+            <w:tcMar>
+              <w:top w:type="dxa" w:w="80"/>
+              <w:left w:type="dxa" w:w="100"/>
+              <w:bottom w:type="dxa" w:w="80"/>
+              <w:right w:type="dxa" w:w="100"/>
+            </w:tcMar>
+          </w:tcPr>
+          <w:p>
+            <w:r>
+              <w:rPr>
+                <w:rFonts w:ascii="Calibri" w:cs="Calibri" w:eastAsia="Calibri" w:hAnsi="Calibri"/>
+                <w:b w:val="false"/>
+                <w:bCs w:val="false"/>
+                <w:sz w:val="20"/>
+                <w:szCs w:val="20"/>
+              </w:rPr>
+              <w:t xml:space="preserve">Yes</w:t>
+            </w:r>
+          </w:p>
+        </w:tc>
+        <w:tc>
+          <w:tcPr>
+            <w:tcW w:type="dxa" w:w="900"/>
+            <w:tcMar>
+              <w:top w:type="dxa" w:w="80"/>
+              <w:left w:type="dxa" w:w="100"/>
+              <w:bottom w:type="dxa" w:w="80"/>
+              <w:right w:type="dxa" w:w="100"/>
+            </w:tcMar>
+          </w:tcPr>
+          <w:p>
+            <w:r>
+              <w:rPr>
+                <w:rFonts w:ascii="Calibri" w:cs="Calibri" w:eastAsia="Calibri" w:hAnsi="Calibri"/>
+                <w:b w:val="false"/>
+                <w:bCs w:val="false"/>
+                <w:sz w:val="20"/>
+                <w:szCs w:val="20"/>
+              </w:rPr>
+              <w:t xml:space="preserve">123</w:t>
+            </w:r>
+          </w:p>
+        </w:tc>
+        <w:tc>
+          <w:tcPr>
+            <w:tcW w:type="dxa" w:w="1800"/>
+            <w:tcMar>
+              <w:top w:type="dxa" w:w="80"/>
+              <w:left w:type="dxa" w:w="100"/>
+              <w:bottom w:type="dxa" w:w="80"/>
+              <w:right w:type="dxa" w:w="100"/>
+            </w:tcMar>
+          </w:tcPr>
+          <w:p>
+            <w:r>
+              <w:rPr>
+                <w:rFonts w:ascii="Calibri" w:cs="Calibri" w:eastAsia="Calibri" w:hAnsi="Calibri"/>
+                <w:b w:val="false"/>
+                <w:bCs w:val="false"/>
+                <w:sz w:val="20"/>
+                <w:szCs w:val="20"/>
+              </w:rPr>
+              <w:t xml:space="preserve">0.143 (mlp)</w:t>
+            </w:r>
+          </w:p>
+        </w:tc>
+      </w:tr>
+      <w:tr>
+        <w:tc>
+          <w:tcPr>
+            <w:tcW w:type="dxa" w:w="3200"/>
+            <w:tcMar>
+              <w:top w:type="dxa" w:w="80"/>
+              <w:left w:type="dxa" w:w="100"/>
+              <w:bottom w:type="dxa" w:w="80"/>
+              <w:right w:type="dxa" w:w="100"/>
+            </w:tcMar>
+          </w:tcPr>
+          <w:p>
+            <w:r>
+              <w:rPr>
+                <w:rFonts w:ascii="Calibri" w:cs="Calibri" w:eastAsia="Calibri" w:hAnsi="Calibri"/>
+                <w:b w:val="false"/>
+                <w:bCs w:val="false"/>
+                <w:sz w:val="20"/>
+                <w:szCs w:val="20"/>
+              </w:rPr>
+              <w:t xml:space="preserve">PEERFIX1 sensitivity (this manuscript, Section 3.3)</w:t>
+            </w:r>
+          </w:p>
+        </w:tc>
+        <w:tc>
+          <w:tcPr>
+            <w:tcW w:type="dxa" w:w="1900"/>
+            <w:tcMar>
+              <w:top w:type="dxa" w:w="80"/>
+              <w:left w:type="dxa" w:w="100"/>
+              <w:bottom w:type="dxa" w:w="80"/>
+              <w:right w:type="dxa" w:w="100"/>
+            </w:tcMar>
+          </w:tcPr>
+          <w:p>
+            <w:r>
+              <w:rPr>
+                <w:rFonts w:ascii="Calibri" w:cs="Calibri" w:eastAsia="Calibri" w:hAnsi="Calibri"/>
+                <w:b w:val="false"/>
+                <w:bCs w:val="false"/>
+                <w:sz w:val="20"/>
+                <w:szCs w:val="20"/>
+              </w:rPr>
+              <w:t xml:space="preserve">Yes</w:t>
+            </w:r>
+          </w:p>
+        </w:tc>
+        <w:tc>
+          <w:tcPr>
+            <w:tcW w:type="dxa" w:w="2200"/>
+            <w:tcMar>
+              <w:top w:type="dxa" w:w="80"/>
+              <w:left w:type="dxa" w:w="100"/>
+              <w:bottom w:type="dxa" w:w="80"/>
+              <w:right w:type="dxa" w:w="100"/>
+            </w:tcMar>
+          </w:tcPr>
+          <w:p>
+            <w:r>
+              <w:rPr>
+                <w:rFonts w:ascii="Calibri" w:cs="Calibri" w:eastAsia="Calibri" w:hAnsi="Calibri"/>
+                <w:b w:val="false"/>
+                <w:bCs w:val="false"/>
+                <w:sz w:val="20"/>
+                <w:szCs w:val="20"/>
+              </w:rPr>
+              <w:t xml:space="preserve">Yes</w:t>
+            </w:r>
+          </w:p>
+        </w:tc>
+        <w:tc>
+          <w:tcPr>
+            <w:tcW w:type="dxa" w:w="900"/>
+            <w:tcMar>
+              <w:top w:type="dxa" w:w="80"/>
+              <w:left w:type="dxa" w:w="100"/>
+              <w:bottom w:type="dxa" w:w="80"/>
+              <w:right w:type="dxa" w:w="100"/>
+            </w:tcMar>
+          </w:tcPr>
+          <w:p>
+            <w:r>
+              <w:rPr>
+                <w:rFonts w:ascii="Calibri" w:cs="Calibri" w:eastAsia="Calibri" w:hAnsi="Calibri"/>
+                <w:b w:val="false"/>
+                <w:bCs w:val="false"/>
+                <w:sz w:val="20"/>
+                <w:szCs w:val="20"/>
+              </w:rPr>
+              <w:t xml:space="preserve">123</w:t>
+            </w:r>
+          </w:p>
+        </w:tc>
+        <w:tc>
+          <w:tcPr>
+            <w:tcW w:type="dxa" w:w="1800"/>
+            <w:tcMar>
+              <w:top w:type="dxa" w:w="80"/>
+              <w:left w:type="dxa" w:w="100"/>
+              <w:bottom w:type="dxa" w:w="80"/>
+              <w:right w:type="dxa" w:w="100"/>
+            </w:tcMar>
+          </w:tcPr>
+          <w:p>
+            <w:r>
+              <w:rPr>
+                <w:rFonts w:ascii="Calibri" w:cs="Calibri" w:eastAsia="Calibri" w:hAnsi="Calibri"/>
+                <w:b w:val="false"/>
+                <w:bCs w:val="false"/>
+                <w:sz w:val="20"/>
+                <w:szCs w:val="20"/>
+              </w:rPr>
+              <w:t xml:space="preserve">0.617 (rf)</w:t>
+            </w:r>
+          </w:p>
+        </w:tc>
+      </w:tr>
+    </w:tbl>
+    <w:p>
+      <w:pPr>
+        <w:spacing w:after="200" w:before="0"/>
+      </w:pPr>
+      <w:r>
+        <w:rPr>
+          <w:rFonts w:ascii="Calibri" w:cs="Calibri" w:eastAsia="Calibri" w:hAnsi="Calibri"/>
+          <w:b w:val="false"/>
+          <w:bCs w:val="false"/>
+          <w:i/>
+          <w:iCs/>
+          <w:sz w:val="20"/>
+          <w:szCs w:val="20"/>
+        </w:rPr>
+        <w:t xml:space="preserve">Table 3. TVAE's TSTR_best across seven reprocessings of the same underlying data, varying only downstream-model regularisation, synthetic-training-set-size convention, and random seed.</w:t>
+      </w:r>
+    </w:p>
+    <w:p>
+      <w:pPr>
+        <w:spacing w:after="200" w:before="0"/>
+      </w:pPr>
+      <w:r>
+        <w:rPr>
+          <w:rFonts w:ascii="Calibri" w:cs="Calibri" w:eastAsia="Calibri" w:hAnsi="Calibri"/>
+          <w:b w:val="false"/>
+          <w:bCs w:val="false"/>
+          <w:i w:val="false"/>
+          <w:iCs w:val="false"/>
+          <w:sz w:val="22"/>
+          <w:szCs w:val="22"/>
+        </w:rPr>
+        <w:t xml:space="preserve">Three observations follow. First, both regularisation and the full-versus-subsampled training-set convention move TSTR_best substantially and in the expected direction — an unregularised random forest overfits the ≈15-point real training split, and subsampling the synthetic training set down to the real training-set size discards information that the factorial expansion was designed to supply, which is itself an argument for training TSTR models on the full synthetic expansion, as Section 2.5 specifies and as the original protocol did. Second, random seed alone accounts for a swing of comparable magnitude (0.207 → 0.442 for otherwise-identical configurations), confirming that n≈20 evaluation is inherently high-variance and that no single seed's result should be reported without either aggregation across seeds or explicit acknowledgement of this sensitivity. Third, and most importantly, TVAE's TSTR_best was positive or at least not negative in six of the seven configurations tested, and was always the least negative or most positive among the four generators when all four were computed under the same configuration — the qualitative finding (TVAE ahead of Gaussian Copula, CTGAN, and TabDDPM) is robust even though the quantitative magnitude is not.</w:t>
+      </w:r>
+    </w:p>
+    <w:p>
+      <w:pPr>
+        <w:spacing w:after="200" w:before="0"/>
+      </w:pPr>
+      <w:r>
+        <w:rPr>
+          <w:rFonts w:ascii="Calibri" w:cs="Calibri" w:eastAsia="Calibri" w:hAnsi="Calibri"/>
+          <w:b w:val="false"/>
+          <w:bCs w:val="false"/>
+          <w:i w:val="false"/>
+          <w:iCs w:val="false"/>
+          <w:sz w:val="22"/>
+          <w:szCs w:val="22"/>
+        </w:rPr>
+        <w:t xml:space="preserve">We report this analysis as a substantive part of the paper's contribution rather than as a limitation to minimise. A protocol that reports a single TSTR value per generator, without characterising its sensitivity to implementation choices that are individually reasonable and individually under-documented in the synthetic-data literature, risks presenting a fragile point estimate as a stable finding. We recommend that future applications of the fidelity–utility–risk–ICD protocol proposed here report, at minimum, the downstream-model regularisation used, the synthetic-training-set-size convention, and results aggregated over multiple seeds — not only multiple runs within one seed, as n_runs=10 already provides in this study.</w:t>
+      </w:r>
+    </w:p>
+    <w:p>
+      <w:pPr>
+        <w:pStyle w:val="Heading2"/>
+        <w:spacing w:after="200" w:before="400"/>
+      </w:pPr>
+      <w:r>
+        <w:rPr>
+          <w:rFonts w:ascii="Calibri" w:cs="Calibri" w:eastAsia="Calibri" w:hAnsi="Calibri"/>
+          <w:b/>
+          <w:bCs/>
+        </w:rPr>
+        <w:t xml:space="preserve">3.7 Practical Implications: Augmenting — Not Replacing — Designed Experiments</w:t>
       </w:r>
     </w:p>
     <w:p>

</xml_diff>